<commit_message>
Lovable 가이드 v3 — advisory API 필드명 반영
</commit_message>
<xml_diff>
--- a/Lovable_연동_개발가이드.docx
+++ b/Lovable_연동_개발가이드.docx
@@ -38,7 +38,7 @@
         <w:rPr>
           <w:sz w:val="20"/>
         </w:rPr>
-        <w:t>작성일: 2026년 5월  |  버전: 2.0  |  대상: 프론트엔드 개발 팀원</w:t>
+        <w:t>작성일: 2026년 5월  |  버전: 3.0  |  대상: 프론트엔드 개발 팀원</w:t>
       </w:r>
     </w:p>
     <w:p/>
@@ -1436,9 +1436,9 @@
         <w:br/>
         <w:t xml:space="preserve">  "정상" -&gt; green (#66BB6A)</w:t>
         <w:br/>
-        <w:t>- Text: "주요 리스크: {category}"</w:t>
+        <w:t>- Text: "주요 뉴스 카테고리: {category}"</w:t>
         <w:br/>
-        <w:t>- Text: "자동 분류 시나리오: {scenario_name}"</w:t>
+        <w:t>- Text: "현재 이슈: {current_issue}"</w:t>
         <w:br/>
         <w:t>- Show loading spinner while fetching</w:t>
         <w:br/>
@@ -2085,6 +2085,20 @@
         <w:t>5-2. 제출 후 표시할 결과</w:t>
       </w:r>
     </w:p>
+    <w:p>
+      <w:pPr>
+        <w:spacing w:after="60"/>
+        <w:ind w:left="283"/>
+        <w:shd w:val="clear" w:color="auto" w:fill="FFF3CD"/>
+      </w:pPr>
+      <w:r>
+        <w:rPr>
+          <w:color w:val="856504"/>
+          <w:sz w:val="20"/>
+        </w:rPr>
+        <w:t xml:space="preserve">  ⚠ 아래 수치는 과거 유사사례 평균 기반 "참고 추정값"입니다. 확정값이 아님을 명시해야 합니다.</w:t>
+      </w:r>
+    </w:p>
     <w:tbl>
       <w:tblPr>
         <w:tblStyle w:val="TableGrid"/>
@@ -2099,7 +2113,7 @@
       <w:tr>
         <w:tc>
           <w:tcPr>
-            <w:tcW w:type="dxa" w:w="1984"/>
+            <w:tcW w:type="dxa" w:w="2268"/>
             <w:shd w:val="clear" w:color="auto" w:fill="2E75B6"/>
           </w:tcPr>
           <w:p>
@@ -2109,7 +2123,7 @@
                 <w:color w:val="FFFFFF"/>
                 <w:sz w:val="18"/>
               </w:rPr>
-              <w:t>항목</w:t>
+              <w:t>API 필드명</w:t>
             </w:r>
           </w:p>
         </w:tc>
@@ -2131,7 +2145,7 @@
         </w:tc>
         <w:tc>
           <w:tcPr>
-            <w:tcW w:type="dxa" w:w="2835"/>
+            <w:tcW w:type="dxa" w:w="3118"/>
             <w:shd w:val="clear" w:color="auto" w:fill="2E75B6"/>
           </w:tcPr>
           <w:p>
@@ -2141,7 +2155,7 @@
                 <w:color w:val="FFFFFF"/>
                 <w:sz w:val="18"/>
               </w:rPr>
-              <w:t>조건</w:t>
+              <w:t>비고</w:t>
             </w:r>
           </w:p>
         </w:tc>
@@ -2149,7 +2163,7 @@
       <w:tr>
         <w:tc>
           <w:tcPr>
-            <w:tcW w:type="dxa" w:w="1984"/>
+            <w:tcW w:type="dxa" w:w="2268"/>
             <w:shd w:val="clear" w:color="auto" w:fill="F0F7FF"/>
           </w:tcPr>
           <w:p>
@@ -2157,7 +2171,7 @@
               <w:rPr>
                 <w:sz w:val="18"/>
               </w:rPr>
-              <w:t>예상 운임</w:t>
+              <w:t>estimated_cost</w:t>
             </w:r>
           </w:p>
         </w:tc>
@@ -2171,13 +2185,13 @@
               <w:rPr>
                 <w:sz w:val="18"/>
               </w:rPr>
-              <w:t>$675 (USD)</w:t>
+              <w:t>예상 운임 $675</w:t>
             </w:r>
           </w:p>
         </w:tc>
         <w:tc>
           <w:tcPr>
-            <w:tcW w:type="dxa" w:w="2835"/>
+            <w:tcW w:type="dxa" w:w="3118"/>
             <w:shd w:val="clear" w:color="auto" w:fill="F0F7FF"/>
           </w:tcPr>
           <w:p>
@@ -2185,7 +2199,7 @@
               <w:rPr>
                 <w:sz w:val="18"/>
               </w:rPr>
-              <w:t>항상</w:t>
+              <w:t>항상 표시</w:t>
             </w:r>
           </w:p>
         </w:tc>
@@ -2193,7 +2207,7 @@
       <w:tr>
         <w:tc>
           <w:tcPr>
-            <w:tcW w:type="dxa" w:w="1984"/>
+            <w:tcW w:type="dxa" w:w="2268"/>
             <w:shd w:val="clear" w:color="auto" w:fill="FFFFFF"/>
           </w:tcPr>
           <w:p>
@@ -2201,7 +2215,7 @@
               <w:rPr>
                 <w:sz w:val="18"/>
               </w:rPr>
-              <w:t>지연 예상</w:t>
+              <w:t>estimated_delay_days</w:t>
             </w:r>
           </w:p>
         </w:tc>
@@ -2215,13 +2229,13 @@
               <w:rPr>
                 <w:sz w:val="18"/>
               </w:rPr>
-              <w:t>+14일</w:t>
+              <w:t>참고 지연 추정 +12일</w:t>
             </w:r>
           </w:p>
         </w:tc>
         <w:tc>
           <w:tcPr>
-            <w:tcW w:type="dxa" w:w="2835"/>
+            <w:tcW w:type="dxa" w:w="3118"/>
             <w:shd w:val="clear" w:color="auto" w:fill="FFFFFF"/>
           </w:tcPr>
           <w:p>
@@ -2229,7 +2243,7 @@
               <w:rPr>
                 <w:sz w:val="18"/>
               </w:rPr>
-              <w:t>항상</w:t>
+              <w:t>과거 유사사례 평균 — 참고용</w:t>
             </w:r>
           </w:p>
         </w:tc>
@@ -2237,7 +2251,7 @@
       <w:tr>
         <w:tc>
           <w:tcPr>
-            <w:tcW w:type="dxa" w:w="1984"/>
+            <w:tcW w:type="dxa" w:w="2268"/>
             <w:shd w:val="clear" w:color="auto" w:fill="F0F7FF"/>
           </w:tcPr>
           <w:p>
@@ -2245,7 +2259,7 @@
               <w:rPr>
                 <w:sz w:val="18"/>
               </w:rPr>
-              <w:t>운임 변화</w:t>
+              <w:t>estimated_cost_delta</w:t>
             </w:r>
           </w:p>
         </w:tc>
@@ -2259,13 +2273,13 @@
               <w:rPr>
                 <w:sz w:val="18"/>
               </w:rPr>
-              <w:t>+$203</w:t>
+              <w:t>참고 운임 변동 +$248</w:t>
             </w:r>
           </w:p>
         </w:tc>
         <w:tc>
           <w:tcPr>
-            <w:tcW w:type="dxa" w:w="2835"/>
+            <w:tcW w:type="dxa" w:w="3118"/>
             <w:shd w:val="clear" w:color="auto" w:fill="F0F7FF"/>
           </w:tcPr>
           <w:p>
@@ -2273,7 +2287,7 @@
               <w:rPr>
                 <w:sz w:val="18"/>
               </w:rPr>
-              <w:t>항상</w:t>
+              <w:t>과거 유사사례 평균 — 참고용</w:t>
             </w:r>
           </w:p>
         </w:tc>
@@ -2281,7 +2295,7 @@
       <w:tr>
         <w:tc>
           <w:tcPr>
-            <w:tcW w:type="dxa" w:w="1984"/>
+            <w:tcW w:type="dxa" w:w="2268"/>
             <w:shd w:val="clear" w:color="auto" w:fill="FFFFFF"/>
           </w:tcPr>
           <w:p>
@@ -2289,7 +2303,7 @@
               <w:rPr>
                 <w:sz w:val="18"/>
               </w:rPr>
-              <w:t>납기 위반 여부</w:t>
+              <w:t>deadline_at_risk</w:t>
             </w:r>
           </w:p>
         </w:tc>
@@ -2303,13 +2317,13 @@
               <w:rPr>
                 <w:sz w:val="18"/>
               </w:rPr>
-              <w:t>⚠ 위험 / ✅ 안전</w:t>
+              <w:t>납기 주의 ⚠ / 여유 ✅</w:t>
             </w:r>
           </w:p>
         </w:tc>
         <w:tc>
           <w:tcPr>
-            <w:tcW w:type="dxa" w:w="2835"/>
+            <w:tcW w:type="dxa" w:w="3118"/>
             <w:shd w:val="clear" w:color="auto" w:fill="FFFFFF"/>
           </w:tcPr>
           <w:p>
@@ -2317,7 +2331,7 @@
               <w:rPr>
                 <w:sz w:val="18"/>
               </w:rPr>
-              <w:t>항상</w:t>
+              <w:t>항상 표시</w:t>
             </w:r>
           </w:p>
         </w:tc>
@@ -2325,7 +2339,7 @@
       <w:tr>
         <w:tc>
           <w:tcPr>
-            <w:tcW w:type="dxa" w:w="1984"/>
+            <w:tcW w:type="dxa" w:w="2268"/>
             <w:shd w:val="clear" w:color="auto" w:fill="F0F7FF"/>
           </w:tcPr>
           <w:p>
@@ -2333,7 +2347,7 @@
               <w:rPr>
                 <w:sz w:val="18"/>
               </w:rPr>
-              <w:t>MRI 맥락</w:t>
+              <w:t>current_issue</w:t>
             </w:r>
           </w:p>
         </w:tc>
@@ -2347,13 +2361,13 @@
               <w:rPr>
                 <w:sz w:val="18"/>
               </w:rPr>
-              <w:t>현재 MRI + 과거 유사사례</w:t>
+              <w:t>현재 이슈 한줄 요약</w:t>
             </w:r>
           </w:p>
         </w:tc>
         <w:tc>
           <w:tcPr>
-            <w:tcW w:type="dxa" w:w="2835"/>
+            <w:tcW w:type="dxa" w:w="3118"/>
             <w:shd w:val="clear" w:color="auto" w:fill="F0F7FF"/>
           </w:tcPr>
           <w:p>
@@ -2361,7 +2375,7 @@
               <w:rPr>
                 <w:sz w:val="18"/>
               </w:rPr>
-              <w:t>항상</w:t>
+              <w:t>advisory_note와 함께 파란 박스에 표시</w:t>
             </w:r>
           </w:p>
         </w:tc>
@@ -2369,7 +2383,7 @@
       <w:tr>
         <w:tc>
           <w:tcPr>
-            <w:tcW w:type="dxa" w:w="1984"/>
+            <w:tcW w:type="dxa" w:w="2268"/>
             <w:shd w:val="clear" w:color="auto" w:fill="FFFFFF"/>
           </w:tcPr>
           <w:p>
@@ -2377,7 +2391,7 @@
               <w:rPr>
                 <w:sz w:val="18"/>
               </w:rPr>
-              <w:t>창고 보관 옵션 버튼</w:t>
+              <w:t>similar_events</w:t>
             </w:r>
           </w:p>
         </w:tc>
@@ -2391,13 +2405,13 @@
               <w:rPr>
                 <w:sz w:val="18"/>
               </w:rPr>
-              <w:t>"창고 보관 옵션 보기" 버튼</w:t>
+              <w:t>유사 과거 사례 목록</w:t>
             </w:r>
           </w:p>
         </w:tc>
         <w:tc>
           <w:tcPr>
-            <w:tcW w:type="dxa" w:w="2835"/>
+            <w:tcW w:type="dxa" w:w="3118"/>
             <w:shd w:val="clear" w:color="auto" w:fill="FFFFFF"/>
           </w:tcPr>
           <w:p>
@@ -2405,7 +2419,95 @@
               <w:rPr>
                 <w:sz w:val="18"/>
               </w:rPr>
-              <w:t>show_warehouse === true 일 때만</w:t>
+              <w:t>사건명, 지연일, 운임변동 카드</w:t>
+            </w:r>
+          </w:p>
+        </w:tc>
+      </w:tr>
+      <w:tr>
+        <w:tc>
+          <w:tcPr>
+            <w:tcW w:type="dxa" w:w="2268"/>
+            <w:shd w:val="clear" w:color="auto" w:fill="F0F7FF"/>
+          </w:tcPr>
+          <w:p>
+            <w:r>
+              <w:rPr>
+                <w:sz w:val="18"/>
+              </w:rPr>
+              <w:t>priority_cargo</w:t>
+            </w:r>
+          </w:p>
+        </w:tc>
+        <w:tc>
+          <w:tcPr>
+            <w:tcW w:type="dxa" w:w="2268"/>
+            <w:shd w:val="clear" w:color="auto" w:fill="F0F7FF"/>
+          </w:tcPr>
+          <w:p>
+            <w:r>
+              <w:rPr>
+                <w:sz w:val="18"/>
+              </w:rPr>
+              <w:t>우선처리 권고 ⭐</w:t>
+            </w:r>
+          </w:p>
+        </w:tc>
+        <w:tc>
+          <w:tcPr>
+            <w:tcW w:type="dxa" w:w="3118"/>
+            <w:shd w:val="clear" w:color="auto" w:fill="F0F7FF"/>
+          </w:tcPr>
+          <w:p>
+            <w:r>
+              <w:rPr>
+                <w:sz w:val="18"/>
+              </w:rPr>
+              <w:t>true일 때만 표시</w:t>
+            </w:r>
+          </w:p>
+        </w:tc>
+      </w:tr>
+      <w:tr>
+        <w:tc>
+          <w:tcPr>
+            <w:tcW w:type="dxa" w:w="2268"/>
+            <w:shd w:val="clear" w:color="auto" w:fill="FFFFFF"/>
+          </w:tcPr>
+          <w:p>
+            <w:r>
+              <w:rPr>
+                <w:sz w:val="18"/>
+              </w:rPr>
+              <w:t>warehouse_recommended</w:t>
+            </w:r>
+          </w:p>
+        </w:tc>
+        <w:tc>
+          <w:tcPr>
+            <w:tcW w:type="dxa" w:w="2268"/>
+            <w:shd w:val="clear" w:color="auto" w:fill="FFFFFF"/>
+          </w:tcPr>
+          <w:p>
+            <w:r>
+              <w:rPr>
+                <w:sz w:val="18"/>
+              </w:rPr>
+              <w:t>"창고 옵션 보기" 버튼</w:t>
+            </w:r>
+          </w:p>
+        </w:tc>
+        <w:tc>
+          <w:tcPr>
+            <w:tcW w:type="dxa" w:w="3118"/>
+            <w:shd w:val="clear" w:color="auto" w:fill="FFFFFF"/>
+          </w:tcPr>
+          <w:p>
+            <w:r>
+              <w:rPr>
+                <w:sz w:val="18"/>
+              </w:rPr>
+              <w:t>true(MRI&gt;=0.5)일 때만 표시</w:t>
             </w:r>
           </w:p>
         </w:tc>
@@ -2477,23 +2579,38 @@
         <w:br/>
         <w:t>Show result card with:</w:t>
         <w:br/>
-        <w:t>- 4 metric cards: estimated_cost ($), delay_days (+Xd),</w:t>
+        <w:t>- 4 metric cards:</w:t>
         <w:br/>
-        <w:t xml:space="preserve">  cost_delta ($+/-), deadline_violated (warning/ok)</w:t>
+        <w:t xml:space="preserve">  1. estimated_cost -&gt; "예상 운임 $X"</w:t>
         <w:br/>
-        <w:t>- MRI context box (blue background):</w:t>
+        <w:t xml:space="preserve">  2. estimated_delay_days -&gt; "참고 지연 추정 +Xd" (add tooltip: 과거 유사사례 평균)</w:t>
         <w:br/>
-        <w:t xml:space="preserve">  "현재 MRI {mri} — {scenario_name}"</w:t>
+        <w:t xml:space="preserve">  3. estimated_cost_delta -&gt; "참고 운임 변동 $+/-X"</w:t>
         <w:br/>
-        <w:t>- If response.requires_priority === true:</w:t>
+        <w:t xml:space="preserve">  4. deadline_at_risk -&gt; "납기 주의 ⚠" or "납기 여유 ✅"</w:t>
         <w:br/>
-        <w:t xml:space="preserve">  show info box "⭐ 우선처리 대상"</w:t>
         <w:br/>
-        <w:t>- If response.requires_holdback === true:</w:t>
+        <w:t>- Advisory info box (blue background):</w:t>
         <w:br/>
-        <w:t xml:space="preserve">  show warning box "◐ 항만 반입 보류 권고"</w:t>
+        <w:t xml:space="preserve">  Title: "현재 해상 리스크 현황"</w:t>
         <w:br/>
-        <w:t>- If response.show_warehouse === true:</w:t>
+        <w:t xml:space="preserve">  Show: "현재 이슈: {current_issue}"</w:t>
+        <w:br/>
+        <w:t xml:space="preserve">  Show: "{advisory_note}" in smaller gray text</w:t>
+        <w:br/>
+        <w:br/>
+        <w:t>- Similar events section (if similar_events.length &gt; 0):</w:t>
+        <w:br/>
+        <w:t xml:space="preserve">  Title: "과거 유사 사례 (참고)"</w:t>
+        <w:br/>
+        <w:t xml:space="preserve">  For each event: "{name} ({date 앞 4자리}년) — 지연 {avg_delay_days}일 / 운임 +{avg_freight_increase_pct}%"</w:t>
+        <w:br/>
+        <w:br/>
+        <w:t>- If response.priority_cargo === true:</w:t>
+        <w:br/>
+        <w:t xml:space="preserve">  show info box "⭐ 우선처리 권고 — 콜드체인/위험물 화물"</w:t>
+        <w:br/>
+        <w:t>- If response.warehouse_recommended === true:</w:t>
         <w:br/>
         <w:t xml:space="preserve">  show primary button "🏭 창고 보관 옵션 보기"</w:t>
         <w:br/>
@@ -2501,7 +2618,7 @@
         <w:br/>
         <w:t xml:space="preserve">  Pass as query params: port_name, cargo_type, cbm,</w:t>
         <w:br/>
-        <w:t xml:space="preserve">  delay_days, freight_usd=estimated_cost</w:t>
+        <w:t xml:space="preserve">  delay_days=estimated_delay_days, freight_usd=estimated_cost</w:t>
       </w:r>
     </w:p>
     <w:p>

</xml_diff>